<commit_message>
Add EMS requirements and fallback to the design
Without a separate plant controller the design now states what the EMS
must provide and how the plant keeps running without it:

- generator start and stop by hardwired contact from the EMS
- PV curtailment through the PLC box, ramped
- written black-start sequence, AH8 first
- EMS failure: level 1 heartbeat alarm, generators start on a dead
  busbar and form the grid, battery off
- under-frequency load shedding in the 11 kV relays, AH6 first, AH4 last

Design report Rev 1: new subsection in section 11, rows in the division
of duties, control authority and fault response tables, open points
16-18. Simulator: EMS failure and load step faults, heartbeat
supervision alarm, EMS and battery values stale while the EMS is down,
81 trips of AH6 then AH4 on overload.

Co-Authored-By: Claude Opus 5.5 <noreply@anthropic.com>
Claude-Session: https://claude.ai/code/session_01UARgDggguUm5LN9SyJ3Gm9
</commit_message>
<xml_diff>
--- a/docs/Villa_Somalia_SCADA_Design_Report_Rev1.docx
+++ b/docs/Villa_Somalia_SCADA_Design_Report_Rev1.docx
@@ -2178,6 +2178,76 @@
           </w:p>
         </w:tc>
       </w:tr>
+      <w:tr>
+        <w:tc>
+          <w:tcPr>
+            <w:tcW w:w="3120" w:type="dxa"/>
+          </w:tcPr>
+          <w:p>
+            <w:pPr/>
+            <w:r>
+              <w:t>Generator start if the EMS fails</w:t>
+            </w:r>
+          </w:p>
+        </w:tc>
+        <w:tc>
+          <w:tcPr>
+            <w:tcW w:w="3120" w:type="dxa"/>
+          </w:tcPr>
+          <w:p>
+            <w:pPr/>
+            <w:r>
+              <w:t>Generator controllers, on dead busbar</w:t>
+            </w:r>
+          </w:p>
+        </w:tc>
+        <w:tc>
+          <w:tcPr>
+            <w:tcW w:w="3120" w:type="dxa"/>
+          </w:tcPr>
+          <w:p>
+            <w:pPr/>
+            <w:r>
+              <w:t>Continues</w:t>
+            </w:r>
+          </w:p>
+        </w:tc>
+      </w:tr>
+      <w:tr>
+        <w:tc>
+          <w:tcPr>
+            <w:tcW w:w="3120" w:type="dxa"/>
+          </w:tcPr>
+          <w:p>
+            <w:pPr/>
+            <w:r>
+              <w:t>Load shedding on under-frequency</w:t>
+            </w:r>
+          </w:p>
+        </w:tc>
+        <w:tc>
+          <w:tcPr>
+            <w:tcW w:w="3120" w:type="dxa"/>
+          </w:tcPr>
+          <w:p>
+            <w:pPr/>
+            <w:r>
+              <w:t>Relays AH6 and AH4</w:t>
+            </w:r>
+          </w:p>
+        </w:tc>
+        <w:tc>
+          <w:tcPr>
+            <w:tcW w:w="3120" w:type="dxa"/>
+          </w:tcPr>
+          <w:p>
+            <w:pPr/>
+            <w:r>
+              <w:t>Continues</w:t>
+            </w:r>
+          </w:p>
+        </w:tc>
+      </w:tr>
     </w:tbl>
     <w:p>
       <w:pPr>
@@ -3648,7 +3718,7 @@
           <w:p>
             <w:pPr/>
             <w:r>
-              <w:t xml:space="preserve">EMS and generator controllers</w:t>
+              <w:t>EMS, by hardwired start contact to the generator controllers</w:t>
             </w:r>
           </w:p>
         </w:tc>
@@ -3855,6 +3925,52 @@
             <w:pPr/>
             <w:r>
               <w:t xml:space="preserve">Monitor</w:t>
+            </w:r>
+          </w:p>
+        </w:tc>
+      </w:tr>
+      <w:tr>
+        <w:tc>
+          <w:tcPr>
+            <w:tcW w:w="2340" w:type="dxa"/>
+          </w:tcPr>
+          <w:p>
+            <w:pPr/>
+            <w:r>
+              <w:t>Load shedding on under-frequency</w:t>
+            </w:r>
+          </w:p>
+        </w:tc>
+        <w:tc>
+          <w:tcPr>
+            <w:tcW w:w="2340" w:type="dxa"/>
+          </w:tcPr>
+          <w:p>
+            <w:pPr/>
+            <w:r>
+              <w:t>Relays AH6, then AH4</w:t>
+            </w:r>
+          </w:p>
+        </w:tc>
+        <w:tc>
+          <w:tcPr>
+            <w:tcW w:w="2340" w:type="dxa"/>
+          </w:tcPr>
+          <w:p>
+            <w:pPr/>
+            <w:r>
+              <w:t>Protection engineer, locally</w:t>
+            </w:r>
+          </w:p>
+        </w:tc>
+        <w:tc>
+          <w:tcPr>
+            <w:tcW w:w="2340" w:type="dxa"/>
+          </w:tcPr>
+          <w:p>
+            <w:pPr/>
+            <w:r>
+              <w:t>Monitor trips; reclose feeders</w:t>
             </w:r>
           </w:p>
         </w:tc>
@@ -7618,7 +7734,7 @@
         <w:t xml:space="preserve">Recovery.</w:t>
       </w:r>
       <w:r>
-        <w:t xml:space="preserve"> A written procedure covers local operation of breakers and generators if the controller or SCADA fails.</w:t>
+        <w:t xml:space="preserve"> A written procedure covers local operation of breakers and generators if the controller or SCADA fails. If the EMS fails, the generators start on their own and supply the plant (section 11).</w:t>
       </w:r>
     </w:p>
     <w:p>
@@ -9049,7 +9165,111 @@
     <w:p>
       <w:pPr/>
       <w:r>
-        <w:t xml:space="preserve">The EMS supplier must confirm which of these steps it carries out automatically and which need an operator command from the SCADA.</w:t>
+        <w:t>The EMS supplier provides this sequence in its functional description, states which steps it carries out automatically and which need an operator command from the SCADA, and demonstrates it at commissioning.</w:t>
+      </w:r>
+    </w:p>
+    <w:p>
+      <w:pPr>
+        <w:pStyle w:val="Heading3"/>
+      </w:pPr>
+      <w:r>
+        <w:t>Requirements on the EMS and fallback</w:t>
+      </w:r>
+    </w:p>
+    <w:p>
+      <w:pPr/>
+      <w:r>
+        <w:t>The design relies on the embedded EMS for dispatch, with no separate plant controller. The EMS supplier must therefore provide the functions below, and the plant must keep supplying the offices if the EMS fails. They are part of the EMS specification and are tested at commissioning.</w:t>
+      </w:r>
+    </w:p>
+    <w:p>
+      <w:pPr>
+        <w:pStyle w:val="ListParagraph"/>
+        <w:numPr>
+          <w:ilvl w:val="0"/>
+          <w:numId w:val="8"/>
+        </w:numPr>
+      </w:pPr>
+      <w:r>
+        <w:rPr>
+          <w:b/>
+        </w:rPr>
+        <w:t>Generator start and stop.</w:t>
+      </w:r>
+      <w:r>
+        <w:t xml:space="preserve"> The EMS starts and stops each generator through a hardwired start contact to the generator controller, so the start does not depend on the CP-8050, the SCADA or the network. A Modbus command may duplicate it. The EMS applies the start below 20% and stop at 80% state of charge, the second-generator rule at 80% of the running generator, the 30% minimum load and lead and lag alternation.</w:t>
+      </w:r>
+    </w:p>
+    <w:p>
+      <w:pPr>
+        <w:pStyle w:val="ListParagraph"/>
+        <w:numPr>
+          <w:ilvl w:val="0"/>
+          <w:numId w:val="8"/>
+        </w:numPr>
+      </w:pPr>
+      <w:r>
+        <w:rPr>
+          <w:b/>
+        </w:rPr>
+        <w:t>PV curtailment.</w:t>
+      </w:r>
+      <w:r>
+        <w:t xml:space="preserve"> The EMS limits the inverters through the PLC box when the battery is full, or when a generator would fall below its minimum load. Output is ramped down rather than tripped. The supplier states the response time from the EMS to the inverters.</w:t>
+      </w:r>
+    </w:p>
+    <w:p>
+      <w:pPr>
+        <w:pStyle w:val="ListParagraph"/>
+        <w:numPr>
+          <w:ilvl w:val="0"/>
+          <w:numId w:val="8"/>
+        </w:numPr>
+      </w:pPr>
+      <w:r>
+        <w:rPr>
+          <w:b/>
+        </w:rPr>
+        <w:t>Black start.</w:t>
+      </w:r>
+      <w:r>
+        <w:t xml:space="preserve"> The EMS supplier provides the black-start sequence above in writing, including AH8 being closed first, and marks each step as automatic or by operator command.</w:t>
+      </w:r>
+    </w:p>
+    <w:p>
+      <w:pPr>
+        <w:pStyle w:val="ListParagraph"/>
+        <w:numPr>
+          <w:ilvl w:val="0"/>
+          <w:numId w:val="8"/>
+        </w:numPr>
+      </w:pPr>
+      <w:r>
+        <w:rPr>
+          <w:b/>
+        </w:rPr>
+        <w:t>EMS failure.</w:t>
+      </w:r>
+      <w:r>
+        <w:t xml:space="preserve"> The CP-8050 monitors the EMS heartbeat and raises a level 1 alarm when it stops. Each generator controller is set to start on its own on a dead busbar, or when the EMS start contact is lost, and to form the grid alone. The offices are then resupplied from the generators without the EMS, and the battery stays off until the EMS is restored.</w:t>
+      </w:r>
+    </w:p>
+    <w:p>
+      <w:pPr>
+        <w:pStyle w:val="ListParagraph"/>
+        <w:numPr>
+          <w:ilvl w:val="0"/>
+          <w:numId w:val="8"/>
+        </w:numPr>
+      </w:pPr>
+      <w:r>
+        <w:rPr>
+          <w:b/>
+        </w:rPr>
+        <w:t>Load shedding.</w:t>
+      </w:r>
+      <w:r>
+        <w:t xml:space="preserve"> If a generator is overloaded and frequency falls, the 11 kV relays shed load by under-frequency protection (81): AH6, the Prime Minister feeder, first, and AH4, the President feeder, last. Proposed settings are 48.5 Hz for 1 s on AH6 and 47.5 Hz for 0.5 s on AH4, to be confirmed by the protection study. The auxiliary feeder AH5 is not shed. Feeders are reclosed by operator command once frequency is stable.</w:t>
       </w:r>
     </w:p>
     <w:p>
@@ -9354,6 +9574,76 @@
             <w:pPr/>
             <w:r>
               <w:t xml:space="preserve">Repair server A</w:t>
+            </w:r>
+          </w:p>
+        </w:tc>
+      </w:tr>
+      <w:tr>
+        <w:tc>
+          <w:tcPr>
+            <w:tcW w:w="3120" w:type="dxa"/>
+          </w:tcPr>
+          <w:p>
+            <w:pPr/>
+            <w:r>
+              <w:t>EMS failure or EMS heartbeat lost</w:t>
+            </w:r>
+          </w:p>
+        </w:tc>
+        <w:tc>
+          <w:tcPr>
+            <w:tcW w:w="3120" w:type="dxa"/>
+          </w:tcPr>
+          <w:p>
+            <w:pPr/>
+            <w:r>
+              <w:t>Level 1 alarm; generators start on dead busbar and supply the plant; battery off</w:t>
+            </w:r>
+          </w:p>
+        </w:tc>
+        <w:tc>
+          <w:tcPr>
+            <w:tcW w:w="3120" w:type="dxa"/>
+          </w:tcPr>
+          <w:p>
+            <w:pPr/>
+            <w:r>
+              <w:t>Call the PV and BESS supplier; check generator loading</w:t>
+            </w:r>
+          </w:p>
+        </w:tc>
+      </w:tr>
+      <w:tr>
+        <w:tc>
+          <w:tcPr>
+            <w:tcW w:w="3120" w:type="dxa"/>
+          </w:tcPr>
+          <w:p>
+            <w:pPr/>
+            <w:r>
+              <w:t>Generator overload, frequency falling</w:t>
+            </w:r>
+          </w:p>
+        </w:tc>
+        <w:tc>
+          <w:tcPr>
+            <w:tcW w:w="3120" w:type="dxa"/>
+          </w:tcPr>
+          <w:p>
+            <w:pPr/>
+            <w:r>
+              <w:t>Relays shed AH6, then AH4, by under-frequency protection</w:t>
+            </w:r>
+          </w:p>
+        </w:tc>
+        <w:tc>
+          <w:tcPr>
+            <w:tcW w:w="3120" w:type="dxa"/>
+          </w:tcPr>
+          <w:p>
+            <w:pPr/>
+            <w:r>
+              <w:t>Reduce load; reclose the feeders from the SCADA when frequency is stable</w:t>
             </w:r>
           </w:p>
         </w:tc>
@@ -12332,6 +12622,144 @@
             <w:pPr/>
             <w:r>
               <w:t>Battery communication points</w:t>
+            </w:r>
+          </w:p>
+        </w:tc>
+      </w:tr>
+      <w:tr>
+        <w:tc>
+          <w:tcPr>
+            <w:tcW w:w="2340" w:type="dxa"/>
+          </w:tcPr>
+          <w:p>
+            <w:pPr/>
+            <w:r>
+              <w:t>16</w:t>
+            </w:r>
+          </w:p>
+        </w:tc>
+        <w:tc>
+          <w:tcPr>
+            <w:tcW w:w="2340" w:type="dxa"/>
+          </w:tcPr>
+          <w:p>
+            <w:pPr/>
+            <w:r>
+              <w:t>EMS functional description: generator start contact and Modbus commands, PV curtailment path and response time, black-start steps marked automatic or by operator, behaviour on loss of the CP-8050 link</w:t>
+            </w:r>
+          </w:p>
+        </w:tc>
+        <w:tc>
+          <w:tcPr>
+            <w:tcW w:w="2340" w:type="dxa"/>
+          </w:tcPr>
+          <w:p>
+            <w:pPr/>
+            <w:r>
+              <w:t>PV and BESS supplier</w:t>
+            </w:r>
+          </w:p>
+        </w:tc>
+        <w:tc>
+          <w:tcPr>
+            <w:tcW w:w="2340" w:type="dxa"/>
+          </w:tcPr>
+          <w:p>
+            <w:pPr/>
+            <w:r>
+              <w:t>Section 11; EMS communication points</w:t>
+            </w:r>
+          </w:p>
+        </w:tc>
+      </w:tr>
+      <w:tr>
+        <w:tc>
+          <w:tcPr>
+            <w:tcW w:w="2340" w:type="dxa"/>
+          </w:tcPr>
+          <w:p>
+            <w:pPr/>
+            <w:r>
+              <w:t>17</w:t>
+            </w:r>
+          </w:p>
+        </w:tc>
+        <w:tc>
+          <w:tcPr>
+            <w:tcW w:w="2340" w:type="dxa"/>
+          </w:tcPr>
+          <w:p>
+            <w:pPr/>
+            <w:r>
+              <w:t>Generator controller start input for the EMS contact; dead-bus automatic start and island operation without the EMS</w:t>
+            </w:r>
+          </w:p>
+        </w:tc>
+        <w:tc>
+          <w:tcPr>
+            <w:tcW w:w="2340" w:type="dxa"/>
+          </w:tcPr>
+          <w:p>
+            <w:pPr/>
+            <w:r>
+              <w:t>Generator supplier</w:t>
+            </w:r>
+          </w:p>
+        </w:tc>
+        <w:tc>
+          <w:tcPr>
+            <w:tcW w:w="2340" w:type="dxa"/>
+          </w:tcPr>
+          <w:p>
+            <w:pPr/>
+            <w:r>
+              <w:t>Section 11; generator settings</w:t>
+            </w:r>
+          </w:p>
+        </w:tc>
+      </w:tr>
+      <w:tr>
+        <w:tc>
+          <w:tcPr>
+            <w:tcW w:w="2340" w:type="dxa"/>
+          </w:tcPr>
+          <w:p>
+            <w:pPr/>
+            <w:r>
+              <w:t>18</w:t>
+            </w:r>
+          </w:p>
+        </w:tc>
+        <w:tc>
+          <w:tcPr>
+            <w:tcW w:w="2340" w:type="dxa"/>
+          </w:tcPr>
+          <w:p>
+            <w:pPr/>
+            <w:r>
+              <w:t>Under-frequency load-shedding settings and shedding order (AH6 first, AH4 last)</w:t>
+            </w:r>
+          </w:p>
+        </w:tc>
+        <w:tc>
+          <w:tcPr>
+            <w:tcW w:w="2340" w:type="dxa"/>
+          </w:tcPr>
+          <w:p>
+            <w:pPr/>
+            <w:r>
+              <w:t>Client and protection engineer</w:t>
+            </w:r>
+          </w:p>
+        </w:tc>
+        <w:tc>
+          <w:tcPr>
+            <w:tcW w:w="2340" w:type="dxa"/>
+          </w:tcPr>
+          <w:p>
+            <w:pPr/>
+            <w:r>
+              <w:t>Section 11; relay settings</w:t>
             </w:r>
           </w:p>
         </w:tc>

</xml_diff>

<commit_message>
Add HMI screen mock-ups to the design report as Attachment E
- Section 12: three mock-ups (overview, 11 kV switchboard, energy
  management) after the screens table; I/O list screen added to the
  table; text states the final screens are built in SICAM SCC
- Attachment E: 12 screens with a description each, as one PDF
  (tools/capture_screens.js, tools/build_attachment_e.js); listed in the
  attachments and compliance tables
- Screen captures moved from docs/Annex_B_Screens to
  docs/Attachment_E_Screens (Attachment B is the I/O list)
- Simulator: on generator black start every available set starts before
  the office feeders close; second generator by load on the running set
  (80 % start, 50 % stop), per the design report

Co-Authored-By: Claude Opus 5.5 <noreply@anthropic.com>
Claude-Session: https://claude.ai/code/session_01UARgDggguUm5LN9SyJ3Gm9
</commit_message>
<xml_diff>
--- a/docs/Villa_Somalia_SCADA_Design_Report_Rev1.docx
+++ b/docs/Villa_Somalia_SCADA_Design_Report_Rev1.docx
@@ -391,7 +391,7 @@
           <w:p>
             <w:pPr/>
             <w:r>
-              <w:t xml:space="preserve">This report with attachments A to D</w:t>
+              <w:t>This report with attachments A to E</w:t>
             </w:r>
           </w:p>
         </w:tc>
@@ -437,18 +437,18 @@
           <w:p>
             <w:pPr/>
             <w:r>
-              <w:t xml:space="preserve">One controller and one SCADA covering every equipment group</w:t>
-            </w:r>
-          </w:p>
-        </w:tc>
-        <w:tc>
-          <w:tcPr>
-            <w:tcW w:w="2340" w:type="dxa"/>
-          </w:tcPr>
-          <w:p>
-            <w:pPr/>
-            <w:r>
-              <w:t xml:space="preserve">3, 4, 5, 6, 12</w:t>
+              <w:t>A redundant controller pair and one SCADA covering every equipment group, with screen mock-ups</w:t>
+            </w:r>
+          </w:p>
+        </w:tc>
+        <w:tc>
+          <w:tcPr>
+            <w:tcW w:w="2340" w:type="dxa"/>
+          </w:tcPr>
+          <w:p>
+            <w:pPr/>
+            <w:r>
+              <w:t>3, 4, 5, 6, 12, Attachment E</w:t>
             </w:r>
           </w:p>
         </w:tc>
@@ -9821,7 +9821,7 @@
     <w:p>
       <w:pPr/>
       <w:r>
-        <w:t xml:space="preserve">The SCADA opens on a single-line overview of the whole plant; every other screen is one click away from it. Screens will be submitted as mock-ups for approval before configuration.</w:t>
+        <w:t>The SCADA opens on a single-line overview of the whole plant; every other screen is one click away from it. Mock-ups of the main screens are shown below and the full set is in Attachment E. They are submitted for approval of layout and content; the final screens are built in SICAM SCC to the same layout before the factory test.</w:t>
       </w:r>
     </w:p>
     <w:tbl>
@@ -10367,7 +10367,168 @@
           </w:p>
         </w:tc>
       </w:tr>
+      <w:tr>
+        <w:tc>
+          <w:tcPr>
+            <w:tcW w:w="3120" w:type="dxa"/>
+          </w:tcPr>
+          <w:p>
+            <w:pPr/>
+            <w:r>
+              <w:t>I/O list</w:t>
+            </w:r>
+          </w:p>
+        </w:tc>
+        <w:tc>
+          <w:tcPr>
+            <w:tcW w:w="3120" w:type="dxa"/>
+          </w:tcPr>
+          <w:p>
+            <w:pPr/>
+            <w:r>
+              <w:t>Every signal with its tag, I/O row, module and channel or protocol source, alarm level and live value</w:t>
+            </w:r>
+          </w:p>
+        </w:tc>
+        <w:tc>
+          <w:tcPr>
+            <w:tcW w:w="3120" w:type="dxa"/>
+          </w:tcPr>
+          <w:p>
+            <w:pPr/>
+            <w:r>
+              <w:t>Filter, export</w:t>
+            </w:r>
+          </w:p>
+        </w:tc>
+      </w:tr>
     </w:tbl>
+    <w:p>
+      <w:r>
+        <w:drawing>
+          <wp:inline>
+            <wp:extent cx="5486400" cy="3257550"/>
+            <wp:docPr id="4" name="Picture 4"/>
+            <wp:cNvGraphicFramePr>
+              <a:graphicFrameLocks noChangeAspect="1"/>
+            </wp:cNvGraphicFramePr>
+            <a:graphic>
+              <a:graphicData uri="http://schemas.openxmlformats.org/drawingml/2006/picture">
+                <pic:pic>
+                  <pic:nvPicPr>
+                    <pic:cNvPr id="0" name="E01_plant_overview.png"/>
+                    <pic:cNvPicPr/>
+                  </pic:nvPicPr>
+                  <pic:blipFill>
+                    <a:blip r:embed="rId6"/>
+                    <a:stretch>
+                      <a:fillRect/>
+                    </a:stretch>
+                  </pic:blipFill>
+                  <pic:spPr>
+                    <a:xfrm>
+                      <a:off x="0" y="0"/>
+                      <a:ext cx="5486400" cy="3257550"/>
+                    </a:xfrm>
+                    <a:prstGeom prst="rect"/>
+                  </pic:spPr>
+                </pic:pic>
+              </a:graphicData>
+            </a:graphic>
+          </wp:inline>
+        </w:drawing>
+      </w:r>
+    </w:p>
+    <w:p>
+      <w:pPr/>
+      <w:r>
+        <w:t>Plant overview · mock-up of the opening screen, a live single-line diagram of the whole plant</w:t>
+      </w:r>
+    </w:p>
+    <w:p>
+      <w:r>
+        <w:drawing>
+          <wp:inline>
+            <wp:extent cx="5486400" cy="3473577"/>
+            <wp:docPr id="5" name="Picture 5"/>
+            <wp:cNvGraphicFramePr>
+              <a:graphicFrameLocks noChangeAspect="1"/>
+            </wp:cNvGraphicFramePr>
+            <a:graphic>
+              <a:graphicData uri="http://schemas.openxmlformats.org/drawingml/2006/picture">
+                <pic:pic>
+                  <pic:nvPicPr>
+                    <pic:cNvPr id="0" name="E02_11kV_switchboard.png"/>
+                    <pic:cNvPicPr/>
+                  </pic:nvPicPr>
+                  <pic:blipFill>
+                    <a:blip r:embed="rId7"/>
+                    <a:stretch>
+                      <a:fillRect/>
+                    </a:stretch>
+                  </pic:blipFill>
+                  <pic:spPr>
+                    <a:xfrm>
+                      <a:off x="0" y="0"/>
+                      <a:ext cx="5486400" cy="3473577"/>
+                    </a:xfrm>
+                    <a:prstGeom prst="rect"/>
+                  </pic:spPr>
+                </pic:pic>
+              </a:graphicData>
+            </a:graphic>
+          </wp:inline>
+        </w:drawing>
+      </w:r>
+    </w:p>
+    <w:p>
+      <w:pPr/>
+      <w:r>
+        <w:t>11 kV switchboard · mock-up, panels AH1 to AH8 with positions, relay status and measurements</w:t>
+      </w:r>
+    </w:p>
+    <w:p>
+      <w:r>
+        <w:drawing>
+          <wp:inline>
+            <wp:extent cx="5486400" cy="3257550"/>
+            <wp:docPr id="6" name="Picture 6"/>
+            <wp:cNvGraphicFramePr>
+              <a:graphicFrameLocks noChangeAspect="1"/>
+            </wp:cNvGraphicFramePr>
+            <a:graphic>
+              <a:graphicData uri="http://schemas.openxmlformats.org/drawingml/2006/picture">
+                <pic:pic>
+                  <pic:nvPicPr>
+                    <pic:cNvPr id="0" name="E07_energy_management.png"/>
+                    <pic:cNvPicPr/>
+                  </pic:nvPicPr>
+                  <pic:blipFill>
+                    <a:blip r:embed="rId8"/>
+                    <a:stretch>
+                      <a:fillRect/>
+                    </a:stretch>
+                  </pic:blipFill>
+                  <pic:spPr>
+                    <a:xfrm>
+                      <a:off x="0" y="0"/>
+                      <a:ext cx="5486400" cy="3257550"/>
+                    </a:xfrm>
+                    <a:prstGeom prst="rect"/>
+                  </pic:spPr>
+                </pic:pic>
+              </a:graphicData>
+            </a:graphic>
+          </wp:inline>
+        </w:drawing>
+      </w:r>
+    </w:p>
+    <w:p>
+      <w:pPr/>
+      <w:r>
+        <w:t>Energy management · mock-up, EMS state, power balance, operating modes and Admin settings</w:t>
+      </w:r>
+    </w:p>
     <w:p>
       <w:pPr>
         <w:pStyle w:val="Heading3"/>
@@ -13067,6 +13228,41 @@
             <w:pPr/>
             <w:r>
               <w:t xml:space="preserve">After terminal schedules are received</w:t>
+            </w:r>
+          </w:p>
+        </w:tc>
+      </w:tr>
+      <w:tr>
+        <w:tc>
+          <w:tcPr>
+            <w:tcW w:w="3120" w:type="dxa"/>
+          </w:tcPr>
+          <w:p>
+            <w:pPr/>
+            <w:r>
+              <w:t>E</w:t>
+            </w:r>
+          </w:p>
+        </w:tc>
+        <w:tc>
+          <w:tcPr>
+            <w:tcW w:w="3120" w:type="dxa"/>
+          </w:tcPr>
+          <w:p>
+            <w:pPr/>
+            <w:r>
+              <w:t>HMI screen mock-ups: 12 screens from the HMI demonstration, including a battery fire (Villa_Somalia_SCADA_Attachment_E_HMI_Screens.pdf)</w:t>
+            </w:r>
+          </w:p>
+        </w:tc>
+        <w:tc>
+          <w:tcPr>
+            <w:tcW w:w="3120" w:type="dxa"/>
+          </w:tcPr>
+          <w:p>
+            <w:pPr/>
+            <w:r>
+              <w:t>Rev 1, complete; final screens built in SICAM SCC</w:t>
             </w:r>
           </w:p>
         </w:tc>

</xml_diff>